<commit_message>
Added Part 1b speed control task to HW04
</commit_message>
<xml_diff>
--- a/homework/hw04/HW04_Assignment.docx
+++ b/homework/hw04/HW04_Assignment.docx
@@ -116,7 +116,7 @@
           <w:sz w:val="22"/>
           <w:szCs w:val="22"/>
         </w:rPr>
-        <w:t xml:space="preserve">Total: 100 points</w:t>
+        <w:t xml:space="preserve">Total: 120 points</w:t>
       </w:r>
     </w:p>
     <w:p>
@@ -433,6 +433,143 @@
           <w:szCs w:val="22"/>
         </w:rPr>
         <w:t xml:space="preserve">In HW03 Part 4, you found that increasing co-contraction in the direct activation model stabilized the arm but at enormous metabolic cost. How does the C-command achieve stiffness modulation differently?</w:t>
+      </w:r>
+    </w:p>
+    <w:p>
+      <w:pPr>
+        <w:spacing w:before="80" w:after="0"/>
+      </w:pPr>
+    </w:p>
+    <w:p>
+      <w:pPr>
+        <w:pStyle w:val="Heading1"/>
+        <w:spacing w:before="300" w:after="200"/>
+      </w:pPr>
+      <w:r>
+        <w:rPr>
+          <w:rFonts w:ascii="Georgia" w:cs="Georgia" w:eastAsia="Georgia" w:hAnsi="Georgia"/>
+          <w:b/>
+          <w:bCs/>
+          <w:color w:val="1B2A4A"/>
+          <w:sz w:val="28"/>
+          <w:szCs w:val="28"/>
+        </w:rPr>
+        <w:t xml:space="preserve">Part 1b: Speed Control via λ Ramp Rate (20 pts)</w:t>
+      </w:r>
+    </w:p>
+    <w:p>
+      <w:pPr>
+        <w:pStyle w:val="Heading2"/>
+        <w:spacing w:before="200" w:after="120"/>
+      </w:pPr>
+      <w:r>
+        <w:rPr>
+          <w:rFonts w:ascii="Georgia" w:cs="Georgia" w:eastAsia="Georgia" w:hAnsi="Georgia"/>
+          <w:b/>
+          <w:bCs/>
+          <w:color w:val="2E86AB"/>
+          <w:sz w:val="24"/>
+          <w:szCs w:val="24"/>
+        </w:rPr>
+        <w:t xml:space="preserve">Task 1b.1 — Vary Ramp Duration for Fixed Amplitude (15 pts)</w:t>
+      </w:r>
+    </w:p>
+    <w:p>
+      <w:pPr>
+        <w:spacing w:after="140" w:line="300"/>
+        <w:jc w:val="both"/>
+      </w:pPr>
+      <w:r>
+        <w:rPr>
+          <w:rFonts w:ascii="Cambria" w:cs="Cambria" w:eastAsia="Cambria" w:hAnsi="Cambria"/>
+          <w:color w:val="333333"/>
+          <w:sz w:val="22"/>
+          <w:szCs w:val="22"/>
+        </w:rPr>
+        <w:t xml:space="preserve">The λ model controls movement speed through the rate of the threshold shift — faster ramps produce faster movements. Perform a straight-ahead reach of 20 cm from Q_REF at five ramp durations: 600, 700, 800, 900, and 1000 ms. The C-command is fixed at C = 0.25 rad. The ramp starts at t = 50 ms in all cases. For each duration, measure: (1) peak hand speed (cm/s), (2) movement duration (time from speed &gt; 1 cm/s to speed &lt; 1 cm/s), and (3) velocity profile symmetry (time of peak speed / movement duration — 0.5 = symmetric). Plot all velocity profiles on one figure. Plot peak speed and symmetry ratio vs. ramp duration.</w:t>
+      </w:r>
+    </w:p>
+    <w:p>
+      <w:pPr>
+        <w:pStyle w:val="Heading2"/>
+        <w:spacing w:before="200" w:after="120"/>
+      </w:pPr>
+      <w:r>
+        <w:rPr>
+          <w:rFonts w:ascii="Georgia" w:cs="Georgia" w:eastAsia="Georgia" w:hAnsi="Georgia"/>
+          <w:b/>
+          <w:bCs/>
+          <w:color w:val="2E86AB"/>
+          <w:sz w:val="24"/>
+          <w:szCs w:val="24"/>
+        </w:rPr>
+        <w:t xml:space="preserve">Question 1b.1 (5 pts)</w:t>
+      </w:r>
+    </w:p>
+    <w:p>
+      <w:pPr>
+        <w:spacing w:after="140" w:line="300"/>
+        <w:jc w:val="both"/>
+      </w:pPr>
+      <w:r>
+        <w:rPr>
+          <w:rFonts w:ascii="Cambria" w:cs="Cambria" w:eastAsia="Cambria" w:hAnsi="Cambria"/>
+          <w:b/>
+          <w:bCs/>
+          <w:color w:val="333333"/>
+          <w:sz w:val="22"/>
+          <w:szCs w:val="22"/>
+        </w:rPr>
+        <w:t xml:space="preserve">(a) </w:t>
+      </w:r>
+      <w:r>
+        <w:rPr>
+          <w:rFonts w:ascii="Cambria" w:cs="Cambria" w:eastAsia="Cambria" w:hAnsi="Cambria"/>
+          <w:color w:val="333333"/>
+          <w:sz w:val="22"/>
+          <w:szCs w:val="22"/>
+        </w:rPr>
+        <w:t xml:space="preserve">How does peak hand speed scale with ramp duration? Is the relationship linear? </w:t>
+      </w:r>
+      <w:r>
+        <w:rPr>
+          <w:rFonts w:ascii="Cambria" w:cs="Cambria" w:eastAsia="Cambria" w:hAnsi="Cambria"/>
+          <w:b/>
+          <w:bCs/>
+          <w:color w:val="333333"/>
+          <w:sz w:val="22"/>
+          <w:szCs w:val="22"/>
+        </w:rPr>
+        <w:t xml:space="preserve">(b) </w:t>
+      </w:r>
+      <w:r>
+        <w:rPr>
+          <w:rFonts w:ascii="Cambria" w:cs="Cambria" w:eastAsia="Cambria" w:hAnsi="Cambria"/>
+          <w:color w:val="333333"/>
+          <w:sz w:val="22"/>
+          <w:szCs w:val="22"/>
+        </w:rPr>
+        <w:t xml:space="preserve">Are the velocity profiles symmetric (ratio ≈ 0.5) or skewed? Does the symmetry change with ramp rate? Compare to the minimum-jerk prediction of perfect symmetry (Week 5). </w:t>
+      </w:r>
+      <w:r>
+        <w:rPr>
+          <w:rFonts w:ascii="Cambria" w:cs="Cambria" w:eastAsia="Cambria" w:hAnsi="Cambria"/>
+          <w:b/>
+          <w:bCs/>
+          <w:color w:val="333333"/>
+          <w:sz w:val="22"/>
+          <w:szCs w:val="22"/>
+        </w:rPr>
+        <w:t xml:space="preserve">(c) </w:t>
+      </w:r>
+      <w:r>
+        <w:rPr>
+          <w:rFonts w:ascii="Cambria" w:cs="Cambria" w:eastAsia="Cambria" w:hAnsi="Cambria"/>
+          <w:color w:val="333333"/>
+          <w:sz w:val="22"/>
+          <w:szCs w:val="22"/>
+        </w:rPr>
+        <w:t xml:space="preserve">The ramp durations range from 600 to 1000 ms, but do the resulting movement durations match these values? If not, explain why — what determines actual movement duration in the λ model versus the ramp duration you command?</w:t>
       </w:r>
     </w:p>
     <w:p>

</xml_diff>

<commit_message>
Restructured Part 1b: linear vs sigmoidal lambda ramps
</commit_message>
<xml_diff>
--- a/homework/hw04/HW04_Assignment.docx
+++ b/homework/hw04/HW04_Assignment.docx
@@ -454,7 +454,7 @@
           <w:sz w:val="28"/>
           <w:szCs w:val="28"/>
         </w:rPr>
-        <w:t xml:space="preserve">Part 1b: Speed Control via λ Ramp Rate (20 pts)</w:t>
+        <w:t xml:space="preserve">Part 1b: Speed Control via λ Ramp Shape (20 pts)</w:t>
       </w:r>
     </w:p>
     <w:p>
@@ -471,22 +471,22 @@
           <w:sz w:val="24"/>
           <w:szCs w:val="24"/>
         </w:rPr>
-        <w:t xml:space="preserve">Task 1b.1 — Vary Ramp Duration for Fixed Amplitude (15 pts)</w:t>
-      </w:r>
-    </w:p>
-    <w:p>
-      <w:pPr>
-        <w:spacing w:after="140" w:line="300"/>
-        <w:jc w:val="both"/>
-      </w:pPr>
-      <w:r>
-        <w:rPr>
-          <w:rFonts w:ascii="Cambria" w:cs="Cambria" w:eastAsia="Cambria" w:hAnsi="Cambria"/>
-          <w:color w:val="333333"/>
-          <w:sz w:val="22"/>
-          <w:szCs w:val="22"/>
-        </w:rPr>
-        <w:t xml:space="preserve">The λ model controls movement speed through the rate of the threshold shift — faster ramps produce faster movements. Perform a straight-ahead reach of 20 cm from Q_REF at five ramp durations: 600, 700, 800, 900, and 1000 ms. The C-command is fixed at C = 0.25 rad. The ramp starts at t = 50 ms in all cases. For each duration, measure: (1) peak hand speed (cm/s), (2) movement duration (time from speed &gt; 1 cm/s to speed &lt; 1 cm/s), and (3) velocity profile symmetry (time of peak speed / movement duration — 0.5 = symmetric). Plot all velocity profiles on one figure. Plot peak speed and symmetry ratio vs. ramp duration.</w:t>
+        <w:t xml:space="preserve">Task 1b.1 — Linear Ramps at Different Durations (8 pts)</w:t>
+      </w:r>
+    </w:p>
+    <w:p>
+      <w:pPr>
+        <w:spacing w:after="140" w:line="300"/>
+        <w:jc w:val="both"/>
+      </w:pPr>
+      <w:r>
+        <w:rPr>
+          <w:rFonts w:ascii="Cambria" w:cs="Cambria" w:eastAsia="Cambria" w:hAnsi="Cambria"/>
+          <w:color w:val="333333"/>
+          <w:sz w:val="22"/>
+          <w:szCs w:val="22"/>
+        </w:rPr>
+        <w:t xml:space="preserve">The λ model controls movement speed through the rate of the threshold shift. Perform a straight-ahead reach of 20 cm from Q_REF at five ramp durations: 600, 700, 800, 900, and 1000 ms. Use C = 0.25 rad. Ramp onset at t = 50 ms. For each duration, measure: (1) peak hand speed (cm/s), (2) movement duration (time from speed &gt; 1 cm/s to speed &lt; 1 cm/s), and (3) velocity profile symmetry (time of peak speed / movement duration — 0.5 = symmetric). Plot all velocity profiles on one figure.</w:t>
       </w:r>
     </w:p>
     <w:p>
@@ -503,6 +503,38 @@
           <w:sz w:val="24"/>
           <w:szCs w:val="24"/>
         </w:rPr>
+        <w:t xml:space="preserve">Task 1b.2 — Sigmoidal λ Ramps (7 pts)</w:t>
+      </w:r>
+    </w:p>
+    <w:p>
+      <w:pPr>
+        <w:spacing w:after="140" w:line="300"/>
+        <w:jc w:val="both"/>
+      </w:pPr>
+      <w:r>
+        <w:rPr>
+          <w:rFonts w:ascii="Cambria" w:cs="Cambria" w:eastAsia="Cambria" w:hAnsi="Cambria"/>
+          <w:color w:val="333333"/>
+          <w:sz w:val="22"/>
+          <w:szCs w:val="22"/>
+        </w:rPr>
+        <w:t xml:space="preserve">The linear ramp produces asymmetric velocity profiles (fast acceleration, slow deceleration tail). Implement a sigmoidal λ ramp using the minimum-jerk temporal profile: λ(t) = λ_start + Δλ · (10τ³ − 15τ⁴ + 6τ⁵), where τ = (t − t_start) / duration. Repeat the same 5 reaches and compare the symmetry ratios. Plot linear vs. sigmoidal symmetry and peak speed on the same figure.</w:t>
+      </w:r>
+    </w:p>
+    <w:p>
+      <w:pPr>
+        <w:pStyle w:val="Heading2"/>
+        <w:spacing w:before="200" w:after="120"/>
+      </w:pPr>
+      <w:r>
+        <w:rPr>
+          <w:rFonts w:ascii="Georgia" w:cs="Georgia" w:eastAsia="Georgia" w:hAnsi="Georgia"/>
+          <w:b/>
+          <w:bCs/>
+          <w:color w:val="2E86AB"/>
+          <w:sz w:val="24"/>
+          <w:szCs w:val="24"/>
+        </w:rPr>
         <w:t xml:space="preserve">Question 1b.1 (5 pts)</w:t>
       </w:r>
     </w:p>
@@ -529,7 +561,7 @@
           <w:sz w:val="22"/>
           <w:szCs w:val="22"/>
         </w:rPr>
-        <w:t xml:space="preserve">How does peak hand speed scale with ramp duration? Is the relationship linear? </w:t>
+        <w:t xml:space="preserve">How does the symmetry ratio differ between linear and sigmoidal ramps? Which produces velocity profiles closer to the symmetric bell shape observed by Morasso (1981)? </w:t>
       </w:r>
       <w:r>
         <w:rPr>
@@ -549,7 +581,7 @@
           <w:sz w:val="22"/>
           <w:szCs w:val="22"/>
         </w:rPr>
-        <w:t xml:space="preserve">Are the velocity profiles symmetric (ratio ≈ 0.5) or skewed? Does the symmetry change with ramp rate? Compare to the minimum-jerk prediction of perfect symmetry (Week 5). </w:t>
+        <w:t xml:space="preserve">The sigmoidal ramp uses the minimum-jerk temporal profile to shape the λ trajectory. What does this imply about the “simplicity” of EPH? If the brain needs to shape λ ramps with a minimum-jerk profile to produce kinematically correct movements, has the λ model really avoided trajectory planning — or has it hidden the planner inside the control signal? </w:t>
       </w:r>
       <w:r>
         <w:rPr>
@@ -569,7 +601,7 @@
           <w:sz w:val="22"/>
           <w:szCs w:val="22"/>
         </w:rPr>
-        <w:t xml:space="preserve">The ramp durations range from 600 to 1000 ms, but do the resulting movement durations match these values? If not, explain why — what determines actual movement duration in the λ model versus the ramp duration you command?</w:t>
+        <w:t xml:space="preserve">Compare peak speeds between linear and sigmoidal ramps at the same duration. Are they the same? If different, explain why in terms of the rate of λ change at movement midpoint.</w:t>
       </w:r>
     </w:p>
     <w:p>

</xml_diff>